<commit_message>
docs: traceability report for commit fc302fa
Co-Authored-By: Claude Opus 5.5 <noreply@anthropic.com>
Claude-Session: https://claude.ai/code/session_01KWVju735VRono8HsF3vuRa
</commit_message>
<xml_diff>
--- a/reports/Traceability_Report.docx
+++ b/reports/Traceability_Report.docx
@@ -374,7 +374,7 @@
                 <w:sz w:val="18"/>
                 <w:szCs w:val="18"/>
               </w:rPr>
-              <w:t xml:space="preserve">Commit 344321b (344321bb9e584b13cc81f6541d96f7419be7d476), 2026-09-29 13:29:00 -0400</w:t>
+              <w:t xml:space="preserve">Commit fc302fa (fc302fa28597c7e06ce1cdb741e14f9e897ce750), 2026-09-29 13:48:02 -0400</w:t>
             </w:r>
           </w:p>
         </w:tc>
@@ -6927,7 +6927,7 @@
                 <w:sz w:val="16"/>
                 <w:szCs w:val="16"/>
               </w:rPr>
-              <w:t xml:space="preserve">42 names differed only in case or spacing; 0 unmatched</w:t>
+              <w:t xml:space="preserve">42 names differed: 41 in case or spacing only, 1 renamed (Petersburg Borough, AK, listed as Petersburg Census Area); 0 unmatched</w:t>
             </w:r>
           </w:p>
         </w:tc>
@@ -8022,7 +8022,7 @@
                 <w:sz w:val="16"/>
                 <w:szCs w:val="16"/>
               </w:rPr>
-              <w:t xml:space="preserve">Panel. One row per county per year 2020-2025 at end of year; supply cumulative by open year; an extra snapshot row (2026-09-22) holds current supply for the app.</w:t>
+              <w:t xml:space="preserve">Panel. One row per county per year 2020-2025 at end of year; supply cumulative by open year. A separate snapshot row per county (2026-09-22) holds current supply for the app and is not part of the panel count.</w:t>
             </w:r>
           </w:p>
         </w:tc>
@@ -8207,7 +8207,7 @@
                 <w:sz w:val="16"/>
                 <w:szCs w:val="16"/>
               </w:rPr>
-              <w:t xml:space="preserve">tests/test_pipeline_outputs.py</w:t>
+              <w:t xml:space="preserve">Computed by reports/traceability_facts.py; tests/test_pipeline_outputs.py checks no in-scope station is lost</w:t>
             </w:r>
           </w:p>
         </w:tc>
@@ -10597,7 +10597,7 @@
                 <w:sz w:val="16"/>
                 <w:szCs w:val="16"/>
               </w:rPr>
-              <w:t xml:space="preserve">Enforced in code; test_labels_defined_correctly.</w:t>
+              <w:t xml:space="preserve">Enforced in panel.py (label shifted one year); tests check 2025 labels are empty, B is defined only where L = 0, and every label equals the next year's outcome.</w:t>
             </w:r>
           </w:p>
         </w:tc>
@@ -12302,7 +12302,7 @@
                 <w:sz w:val="16"/>
                 <w:szCs w:val="16"/>
               </w:rPr>
-              <w:t xml:space="preserve">User can switch to a flat price.</w:t>
+              <w:t xml:space="preserve">User can switch to a flat price. Parser reads the first $/kWh figure only; session, idle and membership fees are ignored.</w:t>
             </w:r>
           </w:p>
         </w:tc>
@@ -12677,7 +12677,7 @@
                 <w:sz w:val="16"/>
                 <w:szCs w:val="16"/>
               </w:rPr>
-              <w:t xml:space="preserve">Model probabilities use end-2025 features while current supply uses the 2026-09-22 snapshot.</w:t>
+              <w:t xml:space="preserve">Model probabilities use end-2025 features while current supply uses the 2026-09-22 snapshot; the snapshot reuses 2025 population and growth.</w:t>
             </w:r>
           </w:p>
         </w:tc>
@@ -12768,6 +12768,626 @@
                 <w:szCs w:val="16"/>
               </w:rPr>
               <w:t xml:space="preserve">Not tested.</w:t>
+            </w:r>
+          </w:p>
+        </w:tc>
+      </w:tr>
+      <w:tr>
+        <w:trPr>
+          <w:cantSplit/>
+        </w:trPr>
+        <w:tc>
+          <w:tcPr>
+            <w:tcW w:type="dxa" w:w="560"/>
+            <w:tcBorders>
+              <w:top w:val="single" w:color="8C8C8C" w:sz="4"/>
+              <w:left w:val="single" w:color="8C8C8C" w:sz="4"/>
+              <w:bottom w:val="single" w:color="8C8C8C" w:sz="4"/>
+              <w:right w:val="single" w:color="8C8C8C" w:sz="4"/>
+            </w:tcBorders>
+            <w:tcMar>
+              <w:top w:type="dxa" w:w="50"/>
+              <w:left w:type="dxa" w:w="90"/>
+              <w:bottom w:type="dxa" w:w="50"/>
+              <w:right w:type="dxa" w:w="90"/>
+            </w:tcMar>
+          </w:tcPr>
+          <w:p>
+            <w:pPr>
+              <w:spacing w:after="0" w:before="0" w:line="240" w:lineRule="auto"/>
+            </w:pPr>
+            <w:r>
+              <w:rPr>
+                <w:rFonts w:ascii="Times New Roman" w:cs="Times New Roman" w:eastAsia="Times New Roman" w:hAnsi="Times New Roman"/>
+                <w:sz w:val="16"/>
+                <w:szCs w:val="16"/>
+              </w:rPr>
+              <w:t xml:space="preserve">A-29</w:t>
+            </w:r>
+          </w:p>
+        </w:tc>
+        <w:tc>
+          <w:tcPr>
+            <w:tcW w:type="dxa" w:w="2850"/>
+            <w:tcBorders>
+              <w:top w:val="single" w:color="8C8C8C" w:sz="4"/>
+              <w:left w:val="single" w:color="8C8C8C" w:sz="4"/>
+              <w:bottom w:val="single" w:color="8C8C8C" w:sz="4"/>
+              <w:right w:val="single" w:color="8C8C8C" w:sz="4"/>
+            </w:tcBorders>
+            <w:tcMar>
+              <w:top w:type="dxa" w:w="50"/>
+              <w:left w:type="dxa" w:w="90"/>
+              <w:bottom w:type="dxa" w:w="50"/>
+              <w:right w:type="dxa" w:w="90"/>
+            </w:tcMar>
+          </w:tcPr>
+          <w:p>
+            <w:pPr>
+              <w:spacing w:after="0" w:before="0" w:line="240" w:lineRule="auto"/>
+            </w:pPr>
+            <w:r>
+              <w:rPr>
+                <w:rFonts w:ascii="Times New Roman" w:cs="Times New Roman" w:eastAsia="Times New Roman" w:hAnsi="Times New Roman"/>
+                <w:sz w:val="16"/>
+                <w:szCs w:val="16"/>
+              </w:rPr>
+              <w:t xml:space="preserve">Each station's current DC port count, and therefore its large-site status, applies from its open year.</w:t>
+            </w:r>
+          </w:p>
+        </w:tc>
+        <w:tc>
+          <w:tcPr>
+            <w:tcW w:type="dxa" w:w="2200"/>
+            <w:tcBorders>
+              <w:top w:val="single" w:color="8C8C8C" w:sz="4"/>
+              <w:left w:val="single" w:color="8C8C8C" w:sz="4"/>
+              <w:bottom w:val="single" w:color="8C8C8C" w:sz="4"/>
+              <w:right w:val="single" w:color="8C8C8C" w:sz="4"/>
+            </w:tcBorders>
+            <w:tcMar>
+              <w:top w:type="dxa" w:w="50"/>
+              <w:left w:type="dxa" w:w="90"/>
+              <w:bottom w:type="dxa" w:w="50"/>
+              <w:right w:type="dxa" w:w="90"/>
+            </w:tcMar>
+          </w:tcPr>
+          <w:p>
+            <w:pPr>
+              <w:spacing w:after="0" w:before="0" w:line="240" w:lineRule="auto"/>
+            </w:pPr>
+            <w:r>
+              <w:rPr>
+                <w:rFonts w:ascii="Times New Roman" w:cs="Times New Roman" w:eastAsia="Times New Roman" w:hAnsi="Times New Roman"/>
+                <w:sz w:val="16"/>
+                <w:szCs w:val="16"/>
+              </w:rPr>
+              <w:t xml:space="preserve">The station file has no port history.</w:t>
+            </w:r>
+          </w:p>
+        </w:tc>
+        <w:tc>
+          <w:tcPr>
+            <w:tcW w:type="dxa" w:w="2150"/>
+            <w:tcBorders>
+              <w:top w:val="single" w:color="8C8C8C" w:sz="4"/>
+              <w:left w:val="single" w:color="8C8C8C" w:sz="4"/>
+              <w:bottom w:val="single" w:color="8C8C8C" w:sz="4"/>
+              <w:right w:val="single" w:color="8C8C8C" w:sz="4"/>
+            </w:tcBorders>
+            <w:tcMar>
+              <w:top w:type="dxa" w:w="50"/>
+              <w:left w:type="dxa" w:w="90"/>
+              <w:bottom w:type="dxa" w:w="50"/>
+              <w:right w:type="dxa" w:w="90"/>
+            </w:tcMar>
+          </w:tcPr>
+          <w:p>
+            <w:pPr>
+              <w:spacing w:after="0" w:before="0" w:line="240" w:lineRule="auto"/>
+            </w:pPr>
+            <w:r>
+              <w:rPr>
+                <w:rFonts w:ascii="Times New Roman" w:cs="Times New Roman" w:eastAsia="Times New Roman" w:hAnsi="Times New Roman"/>
+                <w:sz w:val="16"/>
+                <w:szCs w:val="16"/>
+              </w:rPr>
+              <w:t xml:space="preserve">A site that expanded later counts as large from opening, slightly overstating early large-site events.</w:t>
+            </w:r>
+          </w:p>
+        </w:tc>
+        <w:tc>
+          <w:tcPr>
+            <w:tcW w:type="dxa" w:w="1600"/>
+            <w:tcBorders>
+              <w:top w:val="single" w:color="8C8C8C" w:sz="4"/>
+              <w:left w:val="single" w:color="8C8C8C" w:sz="4"/>
+              <w:bottom w:val="single" w:color="8C8C8C" w:sz="4"/>
+              <w:right w:val="single" w:color="8C8C8C" w:sz="4"/>
+            </w:tcBorders>
+            <w:tcMar>
+              <w:top w:type="dxa" w:w="50"/>
+              <w:left w:type="dxa" w:w="90"/>
+              <w:bottom w:type="dxa" w:w="50"/>
+              <w:right w:type="dxa" w:w="90"/>
+            </w:tcMar>
+          </w:tcPr>
+          <w:p>
+            <w:pPr>
+              <w:spacing w:after="0" w:before="0" w:line="240" w:lineRule="auto"/>
+            </w:pPr>
+            <w:r>
+              <w:rPr>
+                <w:rFonts w:ascii="Times New Roman" w:cs="Times New Roman" w:eastAsia="Times New Roman" w:hAnsi="Times New Roman"/>
+                <w:sz w:val="16"/>
+                <w:szCs w:val="16"/>
+              </w:rPr>
+              <w:t xml:space="preserve">Not tested.</w:t>
+            </w:r>
+          </w:p>
+        </w:tc>
+      </w:tr>
+      <w:tr>
+        <w:trPr>
+          <w:cantSplit/>
+        </w:trPr>
+        <w:tc>
+          <w:tcPr>
+            <w:tcW w:type="dxa" w:w="560"/>
+            <w:tcBorders>
+              <w:top w:val="single" w:color="8C8C8C" w:sz="4"/>
+              <w:left w:val="single" w:color="8C8C8C" w:sz="4"/>
+              <w:bottom w:val="single" w:color="8C8C8C" w:sz="4"/>
+              <w:right w:val="single" w:color="8C8C8C" w:sz="4"/>
+            </w:tcBorders>
+            <w:tcMar>
+              <w:top w:type="dxa" w:w="50"/>
+              <w:left w:type="dxa" w:w="90"/>
+              <w:bottom w:type="dxa" w:w="50"/>
+              <w:right w:type="dxa" w:w="90"/>
+            </w:tcMar>
+          </w:tcPr>
+          <w:p>
+            <w:pPr>
+              <w:spacing w:after="0" w:before="0" w:line="240" w:lineRule="auto"/>
+            </w:pPr>
+            <w:r>
+              <w:rPr>
+                <w:rFonts w:ascii="Times New Roman" w:cs="Times New Roman" w:eastAsia="Times New Roman" w:hAnsi="Times New Roman"/>
+                <w:sz w:val="16"/>
+                <w:szCs w:val="16"/>
+              </w:rPr>
+              <w:t xml:space="preserve">A-30</w:t>
+            </w:r>
+          </w:p>
+        </w:tc>
+        <w:tc>
+          <w:tcPr>
+            <w:tcW w:type="dxa" w:w="2850"/>
+            <w:tcBorders>
+              <w:top w:val="single" w:color="8C8C8C" w:sz="4"/>
+              <w:left w:val="single" w:color="8C8C8C" w:sz="4"/>
+              <w:bottom w:val="single" w:color="8C8C8C" w:sz="4"/>
+              <w:right w:val="single" w:color="8C8C8C" w:sz="4"/>
+            </w:tcBorders>
+            <w:tcMar>
+              <w:top w:type="dxa" w:w="50"/>
+              <w:left w:type="dxa" w:w="90"/>
+              <w:bottom w:type="dxa" w:w="50"/>
+              <w:right w:type="dxa" w:w="90"/>
+            </w:tcMar>
+          </w:tcPr>
+          <w:p>
+            <w:pPr>
+              <w:spacing w:after="0" w:before="0" w:line="240" w:lineRule="auto"/>
+            </w:pPr>
+            <w:r>
+              <w:rPr>
+                <w:rFonts w:ascii="Times New Roman" w:cs="Times New Roman" w:eastAsia="Times New Roman" w:hAnsi="Times New Roman"/>
+                <w:sz w:val="16"/>
+                <w:szCs w:val="16"/>
+              </w:rPr>
+              <w:t xml:space="preserve">Connecticut Interstate miles equal its freeway miles in the allocated totals.</w:t>
+            </w:r>
+          </w:p>
+        </w:tc>
+        <w:tc>
+          <w:tcPr>
+            <w:tcW w:type="dxa" w:w="2200"/>
+            <w:tcBorders>
+              <w:top w:val="single" w:color="8C8C8C" w:sz="4"/>
+              <w:left w:val="single" w:color="8C8C8C" w:sz="4"/>
+              <w:bottom w:val="single" w:color="8C8C8C" w:sz="4"/>
+              <w:right w:val="single" w:color="8C8C8C" w:sz="4"/>
+            </w:tcBorders>
+            <w:tcMar>
+              <w:top w:type="dxa" w:w="50"/>
+              <w:left w:type="dxa" w:w="90"/>
+              <w:bottom w:type="dxa" w:w="50"/>
+              <w:right w:type="dxa" w:w="90"/>
+            </w:tcMar>
+          </w:tcPr>
+          <w:p>
+            <w:pPr>
+              <w:spacing w:after="0" w:before="0" w:line="240" w:lineRule="auto"/>
+            </w:pPr>
+            <w:r>
+              <w:rPr>
+                <w:rFonts w:ascii="Times New Roman" w:cs="Times New Roman" w:eastAsia="Times New Roman" w:hAnsi="Times New Roman"/>
+                <w:sz w:val="16"/>
+                <w:szCs w:val="16"/>
+              </w:rPr>
+              <w:t xml:space="preserve">HPMS legacy-county data does not split the allocation by road class.</w:t>
+            </w:r>
+          </w:p>
+        </w:tc>
+        <w:tc>
+          <w:tcPr>
+            <w:tcW w:type="dxa" w:w="2150"/>
+            <w:tcBorders>
+              <w:top w:val="single" w:color="8C8C8C" w:sz="4"/>
+              <w:left w:val="single" w:color="8C8C8C" w:sz="4"/>
+              <w:bottom w:val="single" w:color="8C8C8C" w:sz="4"/>
+              <w:right w:val="single" w:color="8C8C8C" w:sz="4"/>
+            </w:tcBorders>
+            <w:tcMar>
+              <w:top w:type="dxa" w:w="50"/>
+              <w:left w:type="dxa" w:w="90"/>
+              <w:bottom w:type="dxa" w:w="50"/>
+              <w:right w:type="dxa" w:w="90"/>
+            </w:tcMar>
+          </w:tcPr>
+          <w:p>
+            <w:pPr>
+              <w:spacing w:after="0" w:before="0" w:line="240" w:lineRule="auto"/>
+            </w:pPr>
+            <w:r>
+              <w:rPr>
+                <w:rFonts w:ascii="Times New Roman" w:cs="Times New Roman" w:eastAsia="Times New Roman" w:hAnsi="Times New Roman"/>
+                <w:sz w:val="16"/>
+                <w:szCs w:val="16"/>
+              </w:rPr>
+              <w:t xml:space="preserve">Small overstatement of Interstate miles for 9 counties.</w:t>
+            </w:r>
+          </w:p>
+        </w:tc>
+        <w:tc>
+          <w:tcPr>
+            <w:tcW w:type="dxa" w:w="1600"/>
+            <w:tcBorders>
+              <w:top w:val="single" w:color="8C8C8C" w:sz="4"/>
+              <w:left w:val="single" w:color="8C8C8C" w:sz="4"/>
+              <w:bottom w:val="single" w:color="8C8C8C" w:sz="4"/>
+              <w:right w:val="single" w:color="8C8C8C" w:sz="4"/>
+            </w:tcBorders>
+            <w:tcMar>
+              <w:top w:type="dxa" w:w="50"/>
+              <w:left w:type="dxa" w:w="90"/>
+              <w:bottom w:type="dxa" w:w="50"/>
+              <w:right w:type="dxa" w:w="90"/>
+            </w:tcMar>
+          </w:tcPr>
+          <w:p>
+            <w:pPr>
+              <w:spacing w:after="0" w:before="0" w:line="240" w:lineRule="auto"/>
+            </w:pPr>
+            <w:r>
+              <w:rPr>
+                <w:rFonts w:ascii="Times New Roman" w:cs="Times New Roman" w:eastAsia="Times New Roman" w:hAnsi="Times New Roman"/>
+                <w:sz w:val="16"/>
+                <w:szCs w:val="16"/>
+              </w:rPr>
+              <w:t xml:space="preserve">Flagged (traffic_imputed).</w:t>
+            </w:r>
+          </w:p>
+        </w:tc>
+      </w:tr>
+      <w:tr>
+        <w:trPr>
+          <w:cantSplit/>
+        </w:trPr>
+        <w:tc>
+          <w:tcPr>
+            <w:tcW w:type="dxa" w:w="560"/>
+            <w:tcBorders>
+              <w:top w:val="single" w:color="8C8C8C" w:sz="4"/>
+              <w:left w:val="single" w:color="8C8C8C" w:sz="4"/>
+              <w:bottom w:val="single" w:color="8C8C8C" w:sz="4"/>
+              <w:right w:val="single" w:color="8C8C8C" w:sz="4"/>
+            </w:tcBorders>
+            <w:tcMar>
+              <w:top w:type="dxa" w:w="50"/>
+              <w:left w:type="dxa" w:w="90"/>
+              <w:bottom w:type="dxa" w:w="50"/>
+              <w:right w:type="dxa" w:w="90"/>
+            </w:tcMar>
+          </w:tcPr>
+          <w:p>
+            <w:pPr>
+              <w:spacing w:after="0" w:before="0" w:line="240" w:lineRule="auto"/>
+            </w:pPr>
+            <w:r>
+              <w:rPr>
+                <w:rFonts w:ascii="Times New Roman" w:cs="Times New Roman" w:eastAsia="Times New Roman" w:hAnsi="Times New Roman"/>
+                <w:sz w:val="16"/>
+                <w:szCs w:val="16"/>
+              </w:rPr>
+              <w:t xml:space="preserve">A-31</w:t>
+            </w:r>
+          </w:p>
+        </w:tc>
+        <w:tc>
+          <w:tcPr>
+            <w:tcW w:type="dxa" w:w="2850"/>
+            <w:tcBorders>
+              <w:top w:val="single" w:color="8C8C8C" w:sz="4"/>
+              <w:left w:val="single" w:color="8C8C8C" w:sz="4"/>
+              <w:bottom w:val="single" w:color="8C8C8C" w:sz="4"/>
+              <w:right w:val="single" w:color="8C8C8C" w:sz="4"/>
+            </w:tcBorders>
+            <w:tcMar>
+              <w:top w:type="dxa" w:w="50"/>
+              <w:left w:type="dxa" w:w="90"/>
+              <w:bottom w:type="dxa" w:w="50"/>
+              <w:right w:type="dxa" w:w="90"/>
+            </w:tcMar>
+          </w:tcPr>
+          <w:p>
+            <w:pPr>
+              <w:spacing w:after="0" w:before="0" w:line="240" w:lineRule="auto"/>
+            </w:pPr>
+            <w:r>
+              <w:rPr>
+                <w:rFonts w:ascii="Times New Roman" w:cs="Times New Roman" w:eastAsia="Times New Roman" w:hAnsi="Times New Roman"/>
+                <w:sz w:val="16"/>
+                <w:szCs w:val="16"/>
+              </w:rPr>
+              <w:t xml:space="preserve">Networks are identified by name: Tesla where the network name contains "Tesla"; IONNA by exact name.</w:t>
+            </w:r>
+          </w:p>
+        </w:tc>
+        <w:tc>
+          <w:tcPr>
+            <w:tcW w:type="dxa" w:w="2200"/>
+            <w:tcBorders>
+              <w:top w:val="single" w:color="8C8C8C" w:sz="4"/>
+              <w:left w:val="single" w:color="8C8C8C" w:sz="4"/>
+              <w:bottom w:val="single" w:color="8C8C8C" w:sz="4"/>
+              <w:right w:val="single" w:color="8C8C8C" w:sz="4"/>
+            </w:tcBorders>
+            <w:tcMar>
+              <w:top w:type="dxa" w:w="50"/>
+              <w:left w:type="dxa" w:w="90"/>
+              <w:bottom w:type="dxa" w:w="50"/>
+              <w:right w:type="dxa" w:w="90"/>
+            </w:tcMar>
+          </w:tcPr>
+          <w:p>
+            <w:pPr>
+              <w:spacing w:after="0" w:before="0" w:line="240" w:lineRule="auto"/>
+            </w:pPr>
+            <w:r>
+              <w:rPr>
+                <w:rFonts w:ascii="Times New Roman" w:cs="Times New Roman" w:eastAsia="Times New Roman" w:hAnsi="Times New Roman"/>
+                <w:sz w:val="16"/>
+                <w:szCs w:val="16"/>
+              </w:rPr>
+              <w:t xml:space="preserve">AFDC network field.</w:t>
+            </w:r>
+          </w:p>
+        </w:tc>
+        <w:tc>
+          <w:tcPr>
+            <w:tcW w:type="dxa" w:w="2150"/>
+            <w:tcBorders>
+              <w:top w:val="single" w:color="8C8C8C" w:sz="4"/>
+              <w:left w:val="single" w:color="8C8C8C" w:sz="4"/>
+              <w:bottom w:val="single" w:color="8C8C8C" w:sz="4"/>
+              <w:right w:val="single" w:color="8C8C8C" w:sz="4"/>
+            </w:tcBorders>
+            <w:tcMar>
+              <w:top w:type="dxa" w:w="50"/>
+              <w:left w:type="dxa" w:w="90"/>
+              <w:bottom w:type="dxa" w:w="50"/>
+              <w:right w:type="dxa" w:w="90"/>
+            </w:tcMar>
+          </w:tcPr>
+          <w:p>
+            <w:pPr>
+              <w:spacing w:after="0" w:before="0" w:line="240" w:lineRule="auto"/>
+            </w:pPr>
+            <w:r>
+              <w:rPr>
+                <w:rFonts w:ascii="Times New Roman" w:cs="Times New Roman" w:eastAsia="Times New Roman" w:hAnsi="Times New Roman"/>
+                <w:sz w:val="16"/>
+                <w:szCs w:val="16"/>
+              </w:rPr>
+              <w:t xml:space="preserve">Misspelled or rebranded network names would be misclassified.</w:t>
+            </w:r>
+          </w:p>
+        </w:tc>
+        <w:tc>
+          <w:tcPr>
+            <w:tcW w:type="dxa" w:w="1600"/>
+            <w:tcBorders>
+              <w:top w:val="single" w:color="8C8C8C" w:sz="4"/>
+              <w:left w:val="single" w:color="8C8C8C" w:sz="4"/>
+              <w:bottom w:val="single" w:color="8C8C8C" w:sz="4"/>
+              <w:right w:val="single" w:color="8C8C8C" w:sz="4"/>
+            </w:tcBorders>
+            <w:tcMar>
+              <w:top w:type="dxa" w:w="50"/>
+              <w:left w:type="dxa" w:w="90"/>
+              <w:bottom w:type="dxa" w:w="50"/>
+              <w:right w:type="dxa" w:w="90"/>
+            </w:tcMar>
+          </w:tcPr>
+          <w:p>
+            <w:pPr>
+              <w:spacing w:after="0" w:before="0" w:line="240" w:lineRule="auto"/>
+            </w:pPr>
+            <w:r>
+              <w:rPr>
+                <w:rFonts w:ascii="Times New Roman" w:cs="Times New Roman" w:eastAsia="Times New Roman" w:hAnsi="Times New Roman"/>
+                <w:sz w:val="16"/>
+                <w:szCs w:val="16"/>
+              </w:rPr>
+              <w:t xml:space="preserve">Spot-checked: 180 IONNA sites.</w:t>
+            </w:r>
+          </w:p>
+        </w:tc>
+      </w:tr>
+      <w:tr>
+        <w:trPr>
+          <w:cantSplit/>
+        </w:trPr>
+        <w:tc>
+          <w:tcPr>
+            <w:tcW w:type="dxa" w:w="560"/>
+            <w:tcBorders>
+              <w:top w:val="single" w:color="8C8C8C" w:sz="4"/>
+              <w:left w:val="single" w:color="8C8C8C" w:sz="4"/>
+              <w:bottom w:val="single" w:color="8C8C8C" w:sz="4"/>
+              <w:right w:val="single" w:color="8C8C8C" w:sz="4"/>
+            </w:tcBorders>
+            <w:tcMar>
+              <w:top w:type="dxa" w:w="50"/>
+              <w:left w:type="dxa" w:w="90"/>
+              <w:bottom w:type="dxa" w:w="50"/>
+              <w:right w:type="dxa" w:w="90"/>
+            </w:tcMar>
+          </w:tcPr>
+          <w:p>
+            <w:pPr>
+              <w:spacing w:after="0" w:before="0" w:line="240" w:lineRule="auto"/>
+            </w:pPr>
+            <w:r>
+              <w:rPr>
+                <w:rFonts w:ascii="Times New Roman" w:cs="Times New Roman" w:eastAsia="Times New Roman" w:hAnsi="Times New Roman"/>
+                <w:sz w:val="16"/>
+                <w:szCs w:val="16"/>
+              </w:rPr>
+              <w:t xml:space="preserve">A-32</w:t>
+            </w:r>
+          </w:p>
+        </w:tc>
+        <w:tc>
+          <w:tcPr>
+            <w:tcW w:type="dxa" w:w="2850"/>
+            <w:tcBorders>
+              <w:top w:val="single" w:color="8C8C8C" w:sz="4"/>
+              <w:left w:val="single" w:color="8C8C8C" w:sz="4"/>
+              <w:bottom w:val="single" w:color="8C8C8C" w:sz="4"/>
+              <w:right w:val="single" w:color="8C8C8C" w:sz="4"/>
+            </w:tcBorders>
+            <w:tcMar>
+              <w:top w:type="dxa" w:w="50"/>
+              <w:left w:type="dxa" w:w="90"/>
+              <w:bottom w:type="dxa" w:w="50"/>
+              <w:right w:type="dxa" w:w="90"/>
+            </w:tcMar>
+          </w:tcPr>
+          <w:p>
+            <w:pPr>
+              <w:spacing w:after="0" w:before="0" w:line="240" w:lineRule="auto"/>
+            </w:pPr>
+            <w:r>
+              <w:rPr>
+                <w:rFonts w:ascii="Times New Roman" w:cs="Times New Roman" w:eastAsia="Times New Roman" w:hAnsi="Times New Roman"/>
+                <w:sz w:val="16"/>
+                <w:szCs w:val="16"/>
+              </w:rPr>
+              <w:t xml:space="preserve">Score percentiles are ranked across all 3,144 counties, even when the app user filters by state or minimum population.</w:t>
+            </w:r>
+          </w:p>
+        </w:tc>
+        <w:tc>
+          <w:tcPr>
+            <w:tcW w:type="dxa" w:w="2200"/>
+            <w:tcBorders>
+              <w:top w:val="single" w:color="8C8C8C" w:sz="4"/>
+              <w:left w:val="single" w:color="8C8C8C" w:sz="4"/>
+              <w:bottom w:val="single" w:color="8C8C8C" w:sz="4"/>
+              <w:right w:val="single" w:color="8C8C8C" w:sz="4"/>
+            </w:tcBorders>
+            <w:tcMar>
+              <w:top w:type="dxa" w:w="50"/>
+              <w:left w:type="dxa" w:w="90"/>
+              <w:bottom w:type="dxa" w:w="50"/>
+              <w:right w:type="dxa" w:w="90"/>
+            </w:tcMar>
+          </w:tcPr>
+          <w:p>
+            <w:pPr>
+              <w:spacing w:after="0" w:before="0" w:line="240" w:lineRule="auto"/>
+            </w:pPr>
+            <w:r>
+              <w:rPr>
+                <w:rFonts w:ascii="Times New Roman" w:cs="Times New Roman" w:eastAsia="Times New Roman" w:hAnsi="Times New Roman"/>
+                <w:sz w:val="16"/>
+                <w:szCs w:val="16"/>
+              </w:rPr>
+              <w:t xml:space="preserve">Keeps scores comparable across filters.</w:t>
+            </w:r>
+          </w:p>
+        </w:tc>
+        <w:tc>
+          <w:tcPr>
+            <w:tcW w:type="dxa" w:w="2150"/>
+            <w:tcBorders>
+              <w:top w:val="single" w:color="8C8C8C" w:sz="4"/>
+              <w:left w:val="single" w:color="8C8C8C" w:sz="4"/>
+              <w:bottom w:val="single" w:color="8C8C8C" w:sz="4"/>
+              <w:right w:val="single" w:color="8C8C8C" w:sz="4"/>
+            </w:tcBorders>
+            <w:tcMar>
+              <w:top w:type="dxa" w:w="50"/>
+              <w:left w:type="dxa" w:w="90"/>
+              <w:bottom w:type="dxa" w:w="50"/>
+              <w:right w:type="dxa" w:w="90"/>
+            </w:tcMar>
+          </w:tcPr>
+          <w:p>
+            <w:pPr>
+              <w:spacing w:after="0" w:before="0" w:line="240" w:lineRule="auto"/>
+            </w:pPr>
+            <w:r>
+              <w:rPr>
+                <w:rFonts w:ascii="Times New Roman" w:cs="Times New Roman" w:eastAsia="Times New Roman" w:hAnsi="Times New Roman"/>
+                <w:sz w:val="16"/>
+                <w:szCs w:val="16"/>
+              </w:rPr>
+              <w:t xml:space="preserve">Filtered views show national, not within-filter, percentiles.</w:t>
+            </w:r>
+          </w:p>
+        </w:tc>
+        <w:tc>
+          <w:tcPr>
+            <w:tcW w:type="dxa" w:w="1600"/>
+            <w:tcBorders>
+              <w:top w:val="single" w:color="8C8C8C" w:sz="4"/>
+              <w:left w:val="single" w:color="8C8C8C" w:sz="4"/>
+              <w:bottom w:val="single" w:color="8C8C8C" w:sz="4"/>
+              <w:right w:val="single" w:color="8C8C8C" w:sz="4"/>
+            </w:tcBorders>
+            <w:tcMar>
+              <w:top w:type="dxa" w:w="50"/>
+              <w:left w:type="dxa" w:w="90"/>
+              <w:bottom w:type="dxa" w:w="50"/>
+              <w:right w:type="dxa" w:w="90"/>
+            </w:tcMar>
+          </w:tcPr>
+          <w:p>
+            <w:pPr>
+              <w:spacing w:after="0" w:before="0" w:line="240" w:lineRule="auto"/>
+            </w:pPr>
+            <w:r>
+              <w:rPr>
+                <w:rFonts w:ascii="Times New Roman" w:cs="Times New Roman" w:eastAsia="Times New Roman" w:hAnsi="Times New Roman"/>
+                <w:sz w:val="16"/>
+                <w:szCs w:val="16"/>
+              </w:rPr>
+              <w:t xml:space="preserve">By design.</w:t>
             </w:r>
           </w:p>
         </w:tc>
@@ -15848,7 +16468,7 @@
           <w:sz w:val="22"/>
           <w:szCs w:val="22"/>
         </w:rPr>
-        <w:t xml:space="preserve"> Same form with an L1 penalty (scikit-learn formulation); C chosen from 20 values by 5-fold cross-validated ROC AUC on the training years:</w:t>
+        <w:t xml:space="preserve"> Same form with an L1 penalty (scikit-learn formulation); C chosen from 20 values by 5-fold cross-validated ROC AUC on the training years (folds stratified by row, not grouped by county, so a county can appear on both sides of a fold):</w:t>
       </w:r>
     </w:p>
     <w:p>
@@ -16327,7 +16947,7 @@
           <w:sz w:val="22"/>
           <w:szCs w:val="22"/>
         </w:rPr>
-        <w:t xml:space="preserve">Baselines rank counties by a single variable (population, freeway vehicle-miles, existing DC ports) converted to percentile ranks.</w:t>
+        <w:t xml:space="preserve">Baselines rank counties by a single variable (population, freeway vehicle-miles, existing DC ports) converted to percentile ranks; tied values share their average rank.</w:t>
       </w:r>
     </w:p>
     <w:p>
@@ -18850,7 +19470,7 @@
           <w:sz w:val="22"/>
           <w:szCs w:val="22"/>
         </w:rPr>
-        <w:t xml:space="preserve">When all sites cost the same (the default), selecting the ⌊B / C_site⌋ highest values v_ik is exactly optimal, because v_ik falls with k and every item has equal cost. When costs differ, the application offers a value-per-dollar heuristic or the exact integer program (SciPy milp, HiGHS solver).</w:t>
+        <w:t xml:space="preserve">When all sites cost the same (the default), selecting the ⌊B / C_site⌋ highest values v_ik is exactly optimal, because v_ik falls with k and every item has equal cost. The application uses one cost per site, so this rule is what it applies. A value-per-dollar heuristic and the exact integer program (SciPy milp, HiGHS solver) are implemented in src/evcharge/optimize.py and unit-tested for future use with unequal costs, but the application does not call them today.</w:t>
       </w:r>
     </w:p>
     <w:p>
@@ -19936,7 +20556,7 @@
                 <w:sz w:val="16"/>
                 <w:szCs w:val="16"/>
               </w:rPr>
-              <w:t xml:space="preserve">0.841</w:t>
+              <w:t xml:space="preserve">0.843</w:t>
             </w:r>
           </w:p>
         </w:tc>
@@ -19966,7 +20586,7 @@
                 <w:sz w:val="16"/>
                 <w:szCs w:val="16"/>
               </w:rPr>
-              <w:t xml:space="preserve">0.704</w:t>
+              <w:t xml:space="preserve">0.699</w:t>
             </w:r>
           </w:p>
         </w:tc>
@@ -20091,7 +20711,7 @@
                 <w:sz w:val="16"/>
                 <w:szCs w:val="16"/>
               </w:rPr>
-              <w:t xml:space="preserve">0.847</w:t>
+              <w:t xml:space="preserve">0.848</w:t>
             </w:r>
           </w:p>
         </w:tc>
@@ -20121,7 +20741,7 @@
                 <w:sz w:val="16"/>
                 <w:szCs w:val="16"/>
               </w:rPr>
-              <w:t xml:space="preserve">0.707</w:t>
+              <w:t xml:space="preserve">0.696</w:t>
             </w:r>
           </w:p>
         </w:tc>
@@ -21084,7 +21704,7 @@
                 <w:sz w:val="16"/>
                 <w:szCs w:val="16"/>
               </w:rPr>
-              <w:t xml:space="preserve">0.753</w:t>
+              <w:t xml:space="preserve">0.746</w:t>
             </w:r>
           </w:p>
         </w:tc>
@@ -21114,7 +21734,7 @@
                 <w:sz w:val="16"/>
                 <w:szCs w:val="16"/>
               </w:rPr>
-              <w:t xml:space="preserve">0.263</w:t>
+              <w:t xml:space="preserve">0.255</w:t>
             </w:r>
           </w:p>
         </w:tc>
@@ -21239,7 +21859,7 @@
                 <w:sz w:val="16"/>
                 <w:szCs w:val="16"/>
               </w:rPr>
-              <w:t xml:space="preserve">0.638</w:t>
+              <w:t xml:space="preserve">0.639</w:t>
             </w:r>
           </w:p>
         </w:tc>
@@ -21269,7 +21889,7 @@
                 <w:sz w:val="16"/>
                 <w:szCs w:val="16"/>
               </w:rPr>
-              <w:t xml:space="preserve">0.146</w:t>
+              <w:t xml:space="preserve">0.133</w:t>
             </w:r>
           </w:p>
         </w:tc>
@@ -21299,7 +21919,7 @@
                 <w:sz w:val="16"/>
                 <w:szCs w:val="16"/>
               </w:rPr>
-              <w:t xml:space="preserve">0.182</w:t>
+              <w:t xml:space="preserve">0.217</w:t>
             </w:r>
           </w:p>
         </w:tc>
@@ -25305,7 +25925,7 @@
           <w:sz w:val="22"/>
           <w:szCs w:val="22"/>
         </w:rPr>
-        <w:t xml:space="preserve">R 4.3.3 with glmnet 4.1.8 and pROC 1.18.5, run by R/cross_check.R on the exported panel; output in reports/r_cross_check.md. glmnet's cross-validated penalty retained more features than scikit-learn's (a different penalty grid and selection rule); test AUCs agree within 0.001.</w:t>
+        <w:t xml:space="preserve">R 4.3.3 with glmnet 4.1.8 and pROC 1.18.5, run by R/cross_check.R on the exported panel; output in reports/r_cross_check.md. The two Lasso fits select different penalties (different grids and selection rules): for Target A glmnet kept 17 of 17 features against 8 in scikit-learn; for Target B glmnet kept 8 of 14 non-constant features against 10 of 17. Test AUCs agree within 0.001.</w:t>
       </w:r>
     </w:p>
     <w:p>
@@ -25572,7 +26192,7 @@
                 <w:sz w:val="16"/>
                 <w:szCs w:val="16"/>
               </w:rPr>
-              <w:t xml:space="preserve">tests/test_pipeline_outputs.py (5 tests)</w:t>
+              <w:t xml:space="preserve">tests/test_pipeline_outputs.py (6 tests)</w:t>
             </w:r>
           </w:p>
         </w:tc>
@@ -25602,7 +26222,7 @@
                 <w:sz w:val="16"/>
                 <w:szCs w:val="16"/>
               </w:rPr>
-              <w:t xml:space="preserve">Panel shape and unique keys; label definitions; cumulative supply; no in-scope stations lost in the spatial join; app table ranges; model beats population baseline</w:t>
+              <w:t xml:space="preserve">Panel shape and unique keys; label definitions; labels equal the next year's outcome; cumulative supply; no in-scope stations lost in the spatial join; app table ranges, including that the model beats the population baseline</w:t>
             </w:r>
           </w:p>
         </w:tc>
@@ -25683,7 +26303,7 @@
           <w:sz w:val="22"/>
           <w:szCs w:val="22"/>
         </w:rPr>
-        <w:t xml:space="preserve">Result at the documented commit: 19 passed and 1 skipped by default; the slow test passes when run with RUN_SLOW=1 (20 of 20).</w:t>
+        <w:t xml:space="preserve">Result at the documented commit: 20 passed and 1 skipped by default; the slow test passes when run with RUN_SLOW=1 (21 of 21).</w:t>
       </w:r>
     </w:p>
     <w:p>
@@ -29060,7 +29680,7 @@
         <w:sz w:val="16"/>
         <w:szCs w:val="16"/>
       </w:rPr>
-      <w:t xml:space="preserve">Traceability report, commit 344321b. Page </w:t>
+      <w:t xml:space="preserve">Traceability report, commit fc302fa. Page </w:t>
     </w:r>
     <w:r>
       <w:rPr>

</xml_diff>